<commit_message>
Polish reader navigation and content indexing updates.
Removes the chapter progress bar, improves mobile header/footer navigation behavior, and updates library/story source files and generated manifests.

Made-with: Cursor
</commit_message>
<xml_diff>
--- a/Naked Family/1.docx
+++ b/Naked Family/1.docx
@@ -88,73 +88,31 @@
     </w:p>
     <w:p>
       <w:pPr>
-        <w:spacing w:line="1272" w:lineRule="exact"/>
-        <w:suppressAutoHyphens/>
-        <w:hyphenationLines w:val="0"/>
-        <w:keepNext/>
-        <w:pBdr>
-          <w:top w:val="nil" w:sz="0" w:space="0" w:color="000000" tmln="20, 20, 20, 0, 0"/>
-          <w:left w:val="nil" w:sz="0" w:space="0" w:color="000000" tmln="20, 20, 20, 0, 0"/>
-          <w:bottom w:val="nil" w:sz="0" w:space="0" w:color="000000" tmln="20, 20, 20, 0, 0"/>
-          <w:right w:val="nil" w:sz="0" w:space="0" w:color="000000" tmln="20, 20, 20, 0, 0"/>
-          <w:between w:val="nil" w:sz="0" w:space="0" w:color="000000" tmln="20, 20, 20, 0, 0"/>
-        </w:pBdr>
-        <w:shd w:val="none"/>
-        <w:framePr w:dropCap="drop" w:lines="3" w:wrap="around" w:vAnchor="text" w:hAnchor="text"/>
-        <w:rPr>
-          <w:rFonts w:ascii="Chalkboard" w:hAnsi="Chalkboard" w:eastAsia="Chalkboard" w:cs="Chalkboard"/>
-          <w:bCs/>
-          <w:sz w:val="128"/>
-          <w:szCs w:val="128"/>
-          <w:position w:val="-12"/>
-        </w:rPr>
-      </w:pPr>
-      <w:r>
-        <w:rPr>
-          <w:rFonts w:ascii="Chalkboard" w:hAnsi="Chalkboard" w:eastAsia="Chalkboard" w:cs="Chalkboard"/>
-          <w:bCs/>
-          <w:sz w:val="128"/>
-          <w:szCs w:val="128"/>
-          <w:position w:val="-12"/>
-        </w:rPr>
-        <w:t>I</w:t>
-      </w:r>
-    </w:p>
-    <w:p>
-      <w:pPr>
-        <w:spacing w:line="360" w:lineRule="auto"/>
-        <w:keepNext/>
-        <w:pBdr>
-          <w:top w:val="nil" w:sz="0" w:space="0" w:color="000000" tmln="20, 20, 20, 0, 0"/>
-          <w:left w:val="nil" w:sz="0" w:space="0" w:color="000000" tmln="20, 20, 20, 0, 0"/>
-          <w:bottom w:val="nil" w:sz="0" w:space="0" w:color="000000" tmln="20, 20, 20, 0, 0"/>
-          <w:right w:val="nil" w:sz="0" w:space="0" w:color="000000" tmln="20, 20, 20, 0, 0"/>
-          <w:between w:val="nil" w:sz="0" w:space="0" w:color="000000" tmln="20, 20, 20, 0, 0"/>
-        </w:pBdr>
-        <w:shd w:val="none"/>
-        <w:rPr>
-          <w:rFonts w:ascii="Chalkboard" w:hAnsi="Chalkboard" w:eastAsia="Chalkboard" w:cs="Chalkboard"/>
-          <w:bCs/>
-          <w:sz w:val="24"/>
-          <w:szCs w:val="24"/>
-        </w:rPr>
-      </w:pPr>
-      <w:r>
-        <w:rPr>
-          <w:rFonts w:ascii="Chalkboard" w:hAnsi="Chalkboard" w:eastAsia="Chalkboard" w:cs="Chalkboard"/>
-          <w:bCs/>
-          <w:sz w:val="24"/>
-          <w:szCs w:val="24"/>
-        </w:rPr>
-        <w:t>n many countries, nudity is seen as the ultimate taboo. In my family—and most families I knew—being naked was a strictly timed event, limited to the steam of a shower or the quick rustle of changing clothes behind a locked door. We were raised with the idea that the body was something to be hidden as soon as it was dried. The bathroom was the only "safe zone," a small, tiled sanctuary where the rules of the world were temporarily suspended. Once you turned that brass lock, you were allowed to exist in your own skin, but the moment you stepped back into the hallway, you were expected to be a draped, curated version of yourself.</w:t>
-      </w:r>
-      <w:r>
-        <w:rPr>
-          <w:rFonts w:ascii="Chalkboard" w:hAnsi="Chalkboard" w:eastAsia="Chalkboard" w:cs="Chalkboard"/>
-          <w:bCs/>
-          <w:sz w:val="24"/>
-          <w:szCs w:val="24"/>
-        </w:rPr>
+        <w:spacing w:line="360" w:lineRule="auto"/>
+        <w:keepNext/>
+        <w:pBdr>
+          <w:top w:val="nil" w:sz="0" w:space="0" w:color="000000" tmln="20, 20, 20, 0, 0"/>
+          <w:left w:val="nil" w:sz="0" w:space="0" w:color="000000" tmln="20, 20, 20, 0, 0"/>
+          <w:bottom w:val="nil" w:sz="0" w:space="0" w:color="000000" tmln="20, 20, 20, 0, 0"/>
+          <w:right w:val="nil" w:sz="0" w:space="0" w:color="000000" tmln="20, 20, 20, 0, 0"/>
+          <w:between w:val="nil" w:sz="0" w:space="0" w:color="000000" tmln="20, 20, 20, 0, 0"/>
+        </w:pBdr>
+        <w:shd w:val="none"/>
+        <w:rPr>
+          <w:rFonts w:ascii="Chalkboard" w:hAnsi="Chalkboard" w:eastAsia="Chalkboard" w:cs="Chalkboard"/>
+          <w:bCs/>
+          <w:sz w:val="24"/>
+          <w:szCs w:val="24"/>
+        </w:rPr>
+      </w:pPr>
+      <w:r>
+        <w:rPr>
+          <w:rFonts w:ascii="Chalkboard" w:hAnsi="Chalkboard" w:eastAsia="Chalkboard" w:cs="Chalkboard"/>
+          <w:bCs/>
+          <w:sz w:val="24"/>
+          <w:szCs w:val="24"/>
+        </w:rPr>
+        <w:t>In many countries, nudity is seen as the ultimate taboo. In my family—and most families I knew—being naked was a strictly timed event, limited to the steam of a shower or the quick rustle of changing clothes behind a locked door. We were raised with the idea that the body was something to be hidden as soon as it was dried. The bathroom was the only "safe zone," a small, tiled sanctuary where the rules of the world were temporarily suspended. Once you turned that brass lock, you were allowed to exist in your own skin, but the moment you stepped back into the hallway, you were expected to be a draped, curated version of yourself.</w:t>
       </w:r>
     </w:p>
     <w:p>

</xml_diff>